<commit_message>
Update methodology docs and supplementary materials with latest revisions
</commit_message>
<xml_diff>
--- a/Supplementary Information/Challenges.docx
+++ b/Supplementary Information/Challenges.docx
@@ -369,7 +369,7 @@
         </w:rPr>
         <w:t xml:space="preserve"> </w:t>
       </w:r>
-      <w:hyperlink r:id="R49cf6c48b072410e">
+      <w:hyperlink r:id="R57d76cd2aae740ab">
         <w:r>
           <w:rPr>
             <w:rStyle w:val="Hyperlink"/>
@@ -634,6 +634,7 @@
         </w:rPr>
         <w:t xml:space="preserve">and </w:t>
       </w:r>
+      <w:bookmarkStart w:name="_Int_5HuGCOeY" w:id="1460313034"/>
       <w:r>
         <w:rPr>
           <w:b w:val="0"/>
@@ -641,6 +642,7 @@
         </w:rPr>
         <w:t>permit</w:t>
       </w:r>
+      <w:bookmarkEnd w:id="1460313034"/>
       <w:r>
         <w:rPr>
           <w:b w:val="0"/>
@@ -839,6 +841,7 @@
         </w:rPr>
         <w:t xml:space="preserve">, there are many country x language x speaker </w:t>
       </w:r>
+      <w:bookmarkStart w:name="_Int_kncbvSJb" w:id="2035464135"/>
       <w:r>
         <w:rPr>
           <w:b w:val="0"/>
@@ -846,6 +849,7 @@
         </w:rPr>
         <w:t>population</w:t>
       </w:r>
+      <w:bookmarkEnd w:id="2035464135"/>
       <w:r>
         <w:rPr>
           <w:b w:val="0"/>
@@ -1021,7 +1025,35 @@
           <w:sz w:val="24"/>
           <w:szCs w:val="24"/>
         </w:rPr>
-        <w:t>The harvest makes API calls to list all datasets on the Hub, then separate calls to check whether a dataset includes language code XXX, then further calls to search the README for provenance information, and additional calls to check configuration and Parquet files for size information. This adds up to a significant number of API calls over the course of a harvest run.</w:t>
+        <w:t xml:space="preserve">The harvest makes API calls to list all datasets on the Hub, then separate calls to check whether a dataset includes language code XXX, then further calls to search the README for provenance information, and additional calls to check configuration and Parquet files for size information. This </w:t>
+      </w:r>
+      <w:r>
+        <w:rPr>
+          <w:sz w:val="24"/>
+          <w:szCs w:val="24"/>
+        </w:rPr>
+        <w:t>adds</w:t>
+      </w:r>
+      <w:r>
+        <w:rPr>
+          <w:sz w:val="24"/>
+          <w:szCs w:val="24"/>
+        </w:rPr>
+        <w:t xml:space="preserve"> to a </w:t>
+      </w:r>
+      <w:r>
+        <w:rPr>
+          <w:sz w:val="24"/>
+          <w:szCs w:val="24"/>
+        </w:rPr>
+        <w:t>significant number</w:t>
+      </w:r>
+      <w:r>
+        <w:rPr>
+          <w:sz w:val="24"/>
+          <w:szCs w:val="24"/>
+        </w:rPr>
+        <w:t xml:space="preserve"> of API calls over the course of a harvest run.</w:t>
       </w:r>
     </w:p>
     <w:p>
@@ -1130,6 +1162,7 @@
         </w:rPr>
         <w:t xml:space="preserve">, which raises the rate </w:t>
       </w:r>
+      <w:bookmarkStart w:name="_Int_Ec6ux7Xw" w:id="162253525"/>
       <w:r>
         <w:rPr>
           <w:sz w:val="24"/>
@@ -1137,6 +1170,7 @@
         </w:rPr>
         <w:t>limit</w:t>
       </w:r>
+      <w:bookmarkEnd w:id="162253525"/>
       <w:r>
         <w:rPr>
           <w:sz w:val="24"/>
@@ -1179,6 +1213,7 @@
         </w:rPr>
         <w:t xml:space="preserve">s even when authenticated – but it </w:t>
       </w:r>
+      <w:bookmarkStart w:name="_Int_mIS0POIO" w:id="1908526905"/>
       <w:r>
         <w:rPr>
           <w:sz w:val="24"/>
@@ -1186,6 +1221,7 @@
         </w:rPr>
         <w:t>substantially reduces</w:t>
       </w:r>
+      <w:bookmarkEnd w:id="1908526905"/>
       <w:r>
         <w:rPr>
           <w:sz w:val="24"/>
@@ -1249,16 +1285,25 @@
           <w:sz w:val="24"/>
           <w:szCs w:val="24"/>
         </w:rPr>
-        <w:t xml:space="preserve">users must manually accept licensing and other agreements before they can access the data. In the harvest, if the user running the script had not done this and had not been granted access, this resulted in a </w:t>
-      </w:r>
-      <w:r>
-        <w:rPr>
-          <w:b w:val="0"/>
-          <w:bCs w:val="0"/>
-          <w:sz w:val="24"/>
-          <w:szCs w:val="24"/>
-        </w:rPr>
-        <w:t>404 access</w:t>
+        <w:t>users must manually accept licensing and other agreements before they can access the data.</w:t>
+      </w:r>
+      <w:r>
+        <w:rPr>
+          <w:b w:val="0"/>
+          <w:bCs w:val="0"/>
+          <w:sz w:val="24"/>
+          <w:szCs w:val="24"/>
+        </w:rPr>
+        <w:t xml:space="preserve"> In the harvest, if the user running the script had not done this and had not been granted access, this resulted in a </w:t>
+      </w:r>
+      <w:r>
+        <w:rPr>
+          <w:b w:val="0"/>
+          <w:bCs w:val="0"/>
+          <w:sz w:val="24"/>
+          <w:szCs w:val="24"/>
+        </w:rPr>
+        <w:t>404-access</w:t>
       </w:r>
       <w:r>
         <w:rPr>
@@ -1376,16 +1421,7 @@
           <w:sz w:val="24"/>
           <w:szCs w:val="24"/>
         </w:rPr>
-        <w:t>404</w:t>
-      </w:r>
-      <w:r>
-        <w:rPr>
-          <w:b w:val="0"/>
-          <w:bCs w:val="0"/>
-          <w:sz w:val="24"/>
-          <w:szCs w:val="24"/>
-        </w:rPr>
-        <w:t xml:space="preserve"> access</w:t>
+        <w:t>404-access</w:t>
       </w:r>
       <w:r>
         <w:rPr>
@@ -2401,6 +2437,7 @@
         </w:rPr>
         <w:t xml:space="preserve"> consuming significant local </w:t>
       </w:r>
+      <w:bookmarkStart w:name="_Int_7QEfZ5dz" w:id="1005972740"/>
       <w:r>
         <w:rPr>
           <w:b w:val="0"/>
@@ -2410,6 +2447,7 @@
         </w:rPr>
         <w:t>storage and</w:t>
       </w:r>
+      <w:bookmarkEnd w:id="1005972740"/>
       <w:r>
         <w:rPr>
           <w:b w:val="0"/>
@@ -3015,7 +3053,43 @@
           <w:i w:val="0"/>
           <w:iCs w:val="0"/>
         </w:rPr>
-        <w:t>ince datasets on the Hub range up to hundreds of GB and multiple TB in size, meaning a meaningful share of large dataset’s data could be excluded from our size estimates if this isn’t addressed.</w:t>
+        <w:t xml:space="preserve">ince datasets on the Hub range up to hundreds of GB and multiple TB in size, meaning a meaningful share of large </w:t>
+      </w:r>
+      <w:r>
+        <w:rPr>
+          <w:b w:val="0"/>
+          <w:bCs w:val="0"/>
+          <w:i w:val="0"/>
+          <w:iCs w:val="0"/>
+        </w:rPr>
+        <w:t>dataset</w:t>
+      </w:r>
+      <w:r>
+        <w:rPr>
+          <w:b w:val="0"/>
+          <w:bCs w:val="0"/>
+          <w:i w:val="0"/>
+          <w:iCs w:val="0"/>
+        </w:rPr>
+        <w:t xml:space="preserve"> data could be excluded from our size estimates if this </w:t>
+      </w:r>
+      <w:r>
+        <w:rPr>
+          <w:b w:val="0"/>
+          <w:bCs w:val="0"/>
+          <w:i w:val="0"/>
+          <w:iCs w:val="0"/>
+        </w:rPr>
+        <w:t>isn’t</w:t>
+      </w:r>
+      <w:r>
+        <w:rPr>
+          <w:b w:val="0"/>
+          <w:bCs w:val="0"/>
+          <w:i w:val="0"/>
+          <w:iCs w:val="0"/>
+        </w:rPr>
+        <w:t xml:space="preserve"> addressed.</w:t>
       </w:r>
     </w:p>
     <w:p>
@@ -4613,7 +4687,7 @@
           <w:szCs w:val="24"/>
           <w:lang w:val="en-US"/>
         </w:rPr>
-        <w:t>may genuinely</w:t>
+        <w:t>may</w:t>
       </w:r>
       <w:r>
         <w:rPr>
@@ -4715,7 +4789,58 @@
           <w:szCs w:val="24"/>
           <w:lang w:val="en-US"/>
         </w:rPr>
-        <w:t>. This requires further investigation. If source type truly</w:t>
+        <w:t xml:space="preserve">. This requires further investigation. If </w:t>
+      </w:r>
+      <w:r>
+        <w:rPr>
+          <w:rFonts w:ascii="Aptos" w:hAnsi="Aptos" w:eastAsia="Aptos" w:cs="Aptos"/>
+          <w:b w:val="0"/>
+          <w:bCs w:val="0"/>
+          <w:i w:val="0"/>
+          <w:iCs w:val="0"/>
+          <w:caps w:val="0"/>
+          <w:smallCaps w:val="0"/>
+          <w:noProof w:val="0"/>
+          <w:color w:val="000000" w:themeColor="text1" w:themeTint="FF" w:themeShade="FF"/>
+          <w:sz w:val="24"/>
+          <w:szCs w:val="24"/>
+          <w:lang w:val="en-US"/>
+        </w:rPr>
+        <w:t>the source</w:t>
+      </w:r>
+      <w:r>
+        <w:rPr>
+          <w:rFonts w:ascii="Aptos" w:hAnsi="Aptos" w:eastAsia="Aptos" w:cs="Aptos"/>
+          <w:b w:val="0"/>
+          <w:bCs w:val="0"/>
+          <w:i w:val="0"/>
+          <w:iCs w:val="0"/>
+          <w:caps w:val="0"/>
+          <w:smallCaps w:val="0"/>
+          <w:noProof w:val="0"/>
+          <w:color w:val="000000" w:themeColor="text1" w:themeTint="FF" w:themeShade="FF"/>
+          <w:sz w:val="24"/>
+          <w:szCs w:val="24"/>
+          <w:lang w:val="en-US"/>
+        </w:rPr>
+        <w:t xml:space="preserve"> </w:t>
+      </w:r>
+      <w:r>
+        <w:rPr>
+          <w:rFonts w:ascii="Aptos" w:hAnsi="Aptos" w:eastAsia="Aptos" w:cs="Aptos"/>
+          <w:b w:val="0"/>
+          <w:bCs w:val="0"/>
+          <w:i w:val="0"/>
+          <w:iCs w:val="0"/>
+          <w:caps w:val="0"/>
+          <w:smallCaps w:val="0"/>
+          <w:noProof w:val="0"/>
+          <w:color w:val="000000" w:themeColor="text1" w:themeTint="FF" w:themeShade="FF"/>
+          <w:sz w:val="24"/>
+          <w:szCs w:val="24"/>
+          <w:lang w:val="en-US"/>
+        </w:rPr>
+        <w:t>type</w:t>
       </w:r>
       <w:r>
         <w:rPr>
@@ -5289,7 +5414,7 @@
           <w:szCs w:val="24"/>
           <w:lang w:val="en-US"/>
         </w:rPr>
-        <w:t>likely means</w:t>
+        <w:t>means</w:t>
       </w:r>
       <w:r>
         <w:rPr>
@@ -6127,6 +6252,21 @@
     <int2:textHash int2:hashCode="CG+h73zLckJWHI" int2:id="iFhpB7eW">
       <int2:state int2:type="spell" int2:value="Rejected"/>
     </int2:textHash>
+    <int2:bookmark int2:bookmarkName="_Int_mIS0POIO" int2:invalidationBookmarkName="" int2:hashCode="LpPwsBaWYii7+E" int2:id="3Uh6jh3a">
+      <int2:state int2:type="style" int2:value="Rejected"/>
+    </int2:bookmark>
+    <int2:bookmark int2:bookmarkName="_Int_7QEfZ5dz" int2:invalidationBookmarkName="" int2:hashCode="7pCGwfxaIyqQWL" int2:id="T40RLlQM">
+      <int2:state int2:type="gram" int2:value="Rejected"/>
+    </int2:bookmark>
+    <int2:bookmark int2:bookmarkName="_Int_5HuGCOeY" int2:invalidationBookmarkName="" int2:hashCode="zw8/QW5vooNoxk" int2:id="2cbDCXc5">
+      <int2:state int2:type="style" int2:value="Rejected"/>
+    </int2:bookmark>
+    <int2:bookmark int2:bookmarkName="_Int_Ec6ux7Xw" int2:invalidationBookmarkName="" int2:hashCode="5NaMWpfkZjI8L7" int2:id="eT2PeYD6">
+      <int2:state int2:type="gram" int2:value="Rejected"/>
+    </int2:bookmark>
+    <int2:bookmark int2:bookmarkName="_Int_kncbvSJb" int2:invalidationBookmarkName="" int2:hashCode="200zBXk1JyOeEF" int2:id="mIPWAFZ7">
+      <int2:state int2:type="gram" int2:value="Rejected"/>
+    </int2:bookmark>
     <int2:bookmark int2:bookmarkName="_Int_dSbBNOxY" int2:invalidationBookmarkName="" int2:hashCode="x8CzzVR+WvXj1Q" int2:id="1Fe3Muso">
       <int2:state int2:type="gram" int2:value="Rejected"/>
     </int2:bookmark>
@@ -8072,7 +8212,7 @@
     <w:name w:val="Hyperlink"/>
     <w:basedOn w:val="DefaultParagraphFont"/>
     <w:unhideWhenUsed/>
-    <w:rsid w:val="4738A817"/>
+    <w:rsid w:val="32BA5BD3"/>
     <w:rPr>
       <w:color w:val="467886"/>
       <w:u w:val="single"/>
@@ -8084,7 +8224,7 @@
     <w:basedOn w:val="Normal"/>
     <w:next w:val="Normal"/>
     <w:qFormat/>
-    <w:rsid w:val="4738A817"/>
+    <w:rsid w:val="32BA5BD3"/>
     <w:rPr>
       <w:rFonts w:ascii="Aptos Display" w:hAnsi="Aptos Display" w:eastAsia="ＭＳ ゴシック" w:cs="Times New Roman" w:asciiTheme="majorAscii" w:hAnsiTheme="majorAscii" w:eastAsiaTheme="majorEastAsia" w:cstheme="majorBidi"/>
       <w:color w:val="0F4761" w:themeColor="accent1" w:themeTint="FF" w:themeShade="BF"/>
@@ -8105,7 +8245,7 @@
     <w:next w:val="Normal"/>
     <w:unhideWhenUsed/>
     <w:qFormat/>
-    <w:rsid w:val="4738A817"/>
+    <w:rsid w:val="32BA5BD3"/>
     <w:rPr>
       <w:rFonts w:ascii="Aptos Display" w:hAnsi="Aptos Display" w:eastAsia="ＭＳ ゴシック" w:cs="Times New Roman" w:asciiTheme="majorAscii" w:hAnsiTheme="majorAscii" w:eastAsiaTheme="majorEastAsia" w:cstheme="majorBidi"/>
       <w:color w:val="0F4761" w:themeColor="accent1" w:themeTint="FF" w:themeShade="BF"/>
@@ -8126,7 +8266,7 @@
     <w:next w:val="Normal"/>
     <w:unhideWhenUsed/>
     <w:qFormat/>
-    <w:rsid w:val="4738A817"/>
+    <w:rsid w:val="32BA5BD3"/>
     <w:rPr>
       <w:rFonts w:eastAsia="ＭＳ ゴシック" w:cs="Times New Roman" w:eastAsiaTheme="majorEastAsia" w:cstheme="majorBidi"/>
       <w:color w:val="0F4761" w:themeColor="accent1" w:themeTint="FF" w:themeShade="BF"/>
@@ -8147,7 +8287,7 @@
     <w:next w:val="Normal"/>
     <w:unhideWhenUsed/>
     <w:qFormat/>
-    <w:rsid w:val="4738A817"/>
+    <w:rsid w:val="32BA5BD3"/>
     <w:rPr>
       <w:rFonts w:eastAsia="ＭＳ ゴシック" w:cs="Times New Roman" w:eastAsiaTheme="majorEastAsia" w:cstheme="majorBidi"/>
       <w:color w:val="0F4761" w:themeColor="accent1" w:themeTint="FF" w:themeShade="BF"/>
@@ -8166,7 +8306,7 @@
     <w:next w:val="Normal"/>
     <w:unhideWhenUsed/>
     <w:qFormat/>
-    <w:rsid w:val="4738A817"/>
+    <w:rsid w:val="32BA5BD3"/>
     <w:rPr>
       <w:rFonts w:eastAsia="ＭＳ ゴシック" w:cs="Times New Roman" w:eastAsiaTheme="majorEastAsia" w:cstheme="majorBidi"/>
       <w:i w:val="1"/>

</xml_diff>